<commit_message>
Cafeteria: Level 2 (table voice) is the highest at lunch
</commit_message>
<xml_diff>
--- a/resources/systems/cafeteria.docx
+++ b/resources/systems/cafeteria.docx
@@ -509,7 +509,7 @@
           </w:tcPr>
           <w:p>
             <w:r>
-              <w:t>Show the voice levels on the screen and practice Levels 1, 2, and 3 at a row. Level 3, table voice, is the highest in the cafeteria.</w:t>
+              <w:t>Show the voice levels on the screen and practice Levels 0, 1, and 2 at a row. Level 2, table voice, is the highest in the cafeteria.</w:t>
             </w:r>
             <w:r>
               <w:rPr>
@@ -865,7 +865,7 @@
           <w:color w:val="4A4A4A"/>
           <w:sz w:val="22"/>
         </w:rPr>
-        <w:t>Match the level on the screen. Level 3, table voice, is the highest.</w:t>
+        <w:t>Match the level on the screen. Level 2, table voice, is the highest.</w:t>
       </w:r>
     </w:p>
     <w:p>
@@ -1069,7 +1069,7 @@
           </w:tcPr>
           <w:p>
             <w:r>
-              <w:t>Hold lettered rows and assigned spots. Add: "You set the tone for the whole cafeteria. Show the younger grades what Level 3 and a clean row look like."</w:t>
+              <w:t>Hold lettered rows and assigned spots. Add: "You set the tone for the whole cafeteria. Show the younger grades what Level 2 and a clean row look like."</w:t>
             </w:r>
             <w:r>
               <w:rPr>

</xml_diff>